<commit_message>
feat(validate): mejoras de la prueba del 20-10, pruebas aparte y doc 02 §8.1
- Prompt del paso 2 con el ámbito (interna/externa) de la IP de origen.
- Plazo de la IA a 120 s y precalentamiento del modelo al arrancar.
- Exclusión de 10.0.50.1 y agrupación de alertas del mismo ataque.
- Pruebas de integración en una base aparte (kronos_pruebas).
- Doc 02 §8.1 con los estados nuevos; preguntas-abiertas sin las filas 6, 28, 38, 44 y 45.
- test_alertas_guardadas (llegó en paralelo, #34) también usa la base de pruebas.
</commit_message>
<xml_diff>
--- a/docs/entregables/02_requerimientos.docx
+++ b/docs/entregables/02_requerimientos.docx
@@ -1257,24 +1257,14 @@
       </w:pPr>
       <w:r>
         <w:fldChar w:fldCharType="begin"/>
-      </w:r>
-      <w:r>
         <w:instrText xml:space="preserve"> TOC \o "1-3" \h \z \u </w:instrText>
-      </w:r>
-      <w:r>
         <w:fldChar w:fldCharType="separate"/>
       </w:r>
       <w:hyperlink w:anchor="_Toc0001" w:history="1">
         <w:r>
           <w:rPr/>
           <w:t xml:space="preserve">1. Propósito y alcance</w:t>
-        </w:r>
-        <w:r>
-          <w:rPr/>
           <w:tab/>
-        </w:r>
-        <w:r>
-          <w:rPr/>
           <w:t xml:space="preserve">5</w:t>
         </w:r>
       </w:hyperlink>
@@ -1287,13 +1277,7 @@
         <w:r>
           <w:rPr/>
           <w:t xml:space="preserve">1.1 Cómo se relevaron los requerimientos</w:t>
-        </w:r>
-        <w:r>
-          <w:rPr/>
           <w:tab/>
-        </w:r>
-        <w:r>
-          <w:rPr/>
           <w:t xml:space="preserve">5</w:t>
         </w:r>
       </w:hyperlink>
@@ -1306,13 +1290,7 @@
         <w:r>
           <w:rPr/>
           <w:t xml:space="preserve">1.2 Convenciones</w:t>
-        </w:r>
-        <w:r>
-          <w:rPr/>
           <w:tab/>
-        </w:r>
-        <w:r>
-          <w:rPr/>
           <w:t xml:space="preserve">5</w:t>
         </w:r>
       </w:hyperlink>
@@ -1325,13 +1303,7 @@
         <w:r>
           <w:rPr/>
           <w:t xml:space="preserve">2. Actores</w:t>
-        </w:r>
-        <w:r>
-          <w:rPr/>
           <w:tab/>
-        </w:r>
-        <w:r>
-          <w:rPr/>
           <w:t xml:space="preserve">6</w:t>
         </w:r>
       </w:hyperlink>
@@ -1344,13 +1316,7 @@
         <w:r>
           <w:rPr/>
           <w:t xml:space="preserve">3. Requerimientos funcionales</w:t>
-        </w:r>
-        <w:r>
-          <w:rPr/>
           <w:tab/>
-        </w:r>
-        <w:r>
-          <w:rPr/>
           <w:t xml:space="preserve">6</w:t>
         </w:r>
       </w:hyperlink>
@@ -1363,13 +1329,7 @@
         <w:r>
           <w:rPr/>
           <w:t xml:space="preserve">3.1 Recolección y detección</w:t>
-        </w:r>
-        <w:r>
-          <w:rPr/>
           <w:tab/>
-        </w:r>
-        <w:r>
-          <w:rPr/>
           <w:t xml:space="preserve">6</w:t>
         </w:r>
       </w:hyperlink>
@@ -1382,13 +1342,7 @@
         <w:r>
           <w:rPr/>
           <w:t xml:space="preserve">3.2 Decisión y validación</w:t>
-        </w:r>
-        <w:r>
-          <w:rPr/>
           <w:tab/>
-        </w:r>
-        <w:r>
-          <w:rPr/>
           <w:t xml:space="preserve">6</w:t>
         </w:r>
       </w:hyperlink>
@@ -1401,13 +1355,7 @@
         <w:r>
           <w:rPr/>
           <w:t xml:space="preserve">3.3 Ejecución y niveles de autonomía</w:t>
-        </w:r>
-        <w:r>
-          <w:rPr/>
           <w:tab/>
-        </w:r>
-        <w:r>
-          <w:rPr/>
           <w:t xml:space="preserve">7</w:t>
         </w:r>
       </w:hyperlink>
@@ -1420,13 +1368,7 @@
         <w:r>
           <w:rPr/>
           <w:t xml:space="preserve">3.4 Notificación y consola</w:t>
-        </w:r>
-        <w:r>
-          <w:rPr/>
           <w:tab/>
-        </w:r>
-        <w:r>
-          <w:rPr/>
           <w:t xml:space="preserve">7</w:t>
         </w:r>
       </w:hyperlink>
@@ -1439,13 +1381,7 @@
         <w:r>
           <w:rPr/>
           <w:t xml:space="preserve">3.5 Persistencia e inquilinos</w:t>
-        </w:r>
-        <w:r>
-          <w:rPr/>
           <w:tab/>
-        </w:r>
-        <w:r>
-          <w:rPr/>
           <w:t xml:space="preserve">8</w:t>
         </w:r>
       </w:hyperlink>
@@ -1458,13 +1394,7 @@
         <w:r>
           <w:rPr/>
           <w:t xml:space="preserve">4. Requerimientos no funcionales</w:t>
-        </w:r>
-        <w:r>
-          <w:rPr/>
           <w:tab/>
-        </w:r>
-        <w:r>
-          <w:rPr/>
           <w:t xml:space="preserve">8</w:t>
         </w:r>
       </w:hyperlink>
@@ -1477,13 +1407,7 @@
         <w:r>
           <w:rPr/>
           <w:t xml:space="preserve">5. Requerimientos legales</w:t>
-        </w:r>
-        <w:r>
-          <w:rPr/>
           <w:tab/>
-        </w:r>
-        <w:r>
-          <w:rPr/>
           <w:t xml:space="preserve">9</w:t>
         </w:r>
       </w:hyperlink>
@@ -1496,13 +1420,7 @@
         <w:r>
           <w:rPr/>
           <w:t xml:space="preserve">6. Restricciones de diseño</w:t>
-        </w:r>
-        <w:r>
-          <w:rPr/>
           <w:tab/>
-        </w:r>
-        <w:r>
-          <w:rPr/>
           <w:t xml:space="preserve">10</w:t>
         </w:r>
       </w:hyperlink>
@@ -1515,13 +1433,7 @@
         <w:r>
           <w:rPr/>
           <w:t xml:space="preserve">7. Casos de uso del sistema</w:t>
-        </w:r>
-        <w:r>
-          <w:rPr/>
           <w:tab/>
-        </w:r>
-        <w:r>
-          <w:rPr/>
           <w:t xml:space="preserve">11</w:t>
         </w:r>
       </w:hyperlink>
@@ -1534,13 +1446,7 @@
         <w:r>
           <w:rPr/>
           <w:t xml:space="preserve">7.1 Escenarios por arquetipo de equipo</w:t>
-        </w:r>
-        <w:r>
-          <w:rPr/>
           <w:tab/>
-        </w:r>
-        <w:r>
-          <w:rPr/>
           <w:t xml:space="preserve">12</w:t>
         </w:r>
       </w:hyperlink>
@@ -1553,13 +1459,7 @@
         <w:r>
           <w:rPr/>
           <w:t xml:space="preserve">8. Estados</w:t>
-        </w:r>
-        <w:r>
-          <w:rPr/>
           <w:tab/>
-        </w:r>
-        <w:r>
-          <w:rPr/>
           <w:t xml:space="preserve">13</w:t>
         </w:r>
       </w:hyperlink>
@@ -1572,13 +1472,7 @@
         <w:r>
           <w:rPr/>
           <w:t xml:space="preserve">8.1 Estados del ticket</w:t>
-        </w:r>
-        <w:r>
-          <w:rPr/>
           <w:tab/>
-        </w:r>
-        <w:r>
-          <w:rPr/>
           <w:t xml:space="preserve">13</w:t>
         </w:r>
       </w:hyperlink>
@@ -1591,13 +1485,7 @@
         <w:r>
           <w:rPr/>
           <w:t xml:space="preserve">8.2 Estados del cortacircuito</w:t>
-        </w:r>
-        <w:r>
-          <w:rPr/>
           <w:tab/>
-        </w:r>
-        <w:r>
-          <w:rPr/>
           <w:t xml:space="preserve">14</w:t>
         </w:r>
       </w:hyperlink>
@@ -1610,13 +1498,7 @@
         <w:r>
           <w:rPr/>
           <w:t xml:space="preserve">9. Priorización</w:t>
-        </w:r>
-        <w:r>
-          <w:rPr/>
           <w:tab/>
-        </w:r>
-        <w:r>
-          <w:rPr/>
           <w:t xml:space="preserve">14</w:t>
         </w:r>
       </w:hyperlink>
@@ -1629,13 +1511,7 @@
         <w:r>
           <w:rPr/>
           <w:t xml:space="preserve">9.1 Criterios de aceptación del servicio</w:t>
-        </w:r>
-        <w:r>
-          <w:rPr/>
           <w:tab/>
-        </w:r>
-        <w:r>
-          <w:rPr/>
           <w:t xml:space="preserve">15</w:t>
         </w:r>
       </w:hyperlink>
@@ -1648,13 +1524,7 @@
         <w:r>
           <w:rPr/>
           <w:t xml:space="preserve">10. Trazabilidad</w:t>
-        </w:r>
-        <w:r>
-          <w:rPr/>
           <w:tab/>
-        </w:r>
-        <w:r>
-          <w:rPr/>
           <w:t xml:space="preserve">15</w:t>
         </w:r>
       </w:hyperlink>
@@ -1667,13 +1537,7 @@
         <w:r>
           <w:rPr/>
           <w:t xml:space="preserve">11. Referencias</w:t>
-        </w:r>
-        <w:r>
-          <w:rPr/>
           <w:tab/>
-        </w:r>
-        <w:r>
-          <w:rPr/>
           <w:t xml:space="preserve">15</w:t>
         </w:r>
       </w:hyperlink>
@@ -1701,24 +1565,14 @@
       </w:pPr>
       <w:r>
         <w:fldChar w:fldCharType="begin"/>
-      </w:r>
-      <w:r>
         <w:instrText xml:space="preserve"> TOC \h \z \c "Figura" </w:instrText>
-      </w:r>
-      <w:r>
         <w:fldChar w:fldCharType="separate"/>
       </w:r>
       <w:hyperlink w:anchor="_Fig001" w:history="1">
         <w:r>
           <w:rPr/>
           <w:t xml:space="preserve">Figura 1. Casos de uso del sistema y sus actores</w:t>
-        </w:r>
-        <w:r>
-          <w:rPr/>
           <w:tab/>
-        </w:r>
-        <w:r>
-          <w:rPr/>
           <w:t xml:space="preserve">11</w:t>
         </w:r>
       </w:hyperlink>
@@ -1731,13 +1585,7 @@
         <w:r>
           <w:rPr/>
           <w:t xml:space="preserve">Figura 2. Tratamiento de una decisión según su nivel de autonomía</w:t>
-        </w:r>
-        <w:r>
-          <w:rPr/>
           <w:tab/>
-        </w:r>
-        <w:r>
-          <w:rPr/>
           <w:t xml:space="preserve">12</w:t>
         </w:r>
       </w:hyperlink>
@@ -1750,13 +1598,7 @@
         <w:r>
           <w:rPr/>
           <w:t xml:space="preserve">Figura 3. Estados del ticket</w:t>
-        </w:r>
-        <w:r>
-          <w:rPr/>
           <w:tab/>
-        </w:r>
-        <w:r>
-          <w:rPr/>
           <w:t xml:space="preserve">13</w:t>
         </w:r>
       </w:hyperlink>
@@ -1769,13 +1611,7 @@
         <w:r>
           <w:rPr/>
           <w:t xml:space="preserve">Figura 4. Estados del cortacircuito por ámbito</w:t>
-        </w:r>
-        <w:r>
-          <w:rPr/>
           <w:tab/>
-        </w:r>
-        <w:r>
-          <w:rPr/>
           <w:t xml:space="preserve">14</w:t>
         </w:r>
       </w:hyperlink>
@@ -1803,24 +1639,14 @@
       </w:pPr>
       <w:r>
         <w:fldChar w:fldCharType="begin"/>
-      </w:r>
-      <w:r>
         <w:instrText xml:space="preserve"> TOC \h \z \c "Tabla" </w:instrText>
-      </w:r>
-      <w:r>
         <w:fldChar w:fldCharType="separate"/>
       </w:r>
       <w:hyperlink w:anchor="_Tab001" w:history="1">
         <w:r>
           <w:rPr/>
           <w:t xml:space="preserve">Tabla 1. Identificadores usados en este documento</w:t>
-        </w:r>
-        <w:r>
-          <w:rPr/>
           <w:tab/>
-        </w:r>
-        <w:r>
-          <w:rPr/>
           <w:t xml:space="preserve">5</w:t>
         </w:r>
       </w:hyperlink>
@@ -1833,13 +1659,7 @@
         <w:r>
           <w:rPr/>
           <w:t xml:space="preserve">Tabla 2. Actores del sistema</w:t>
-        </w:r>
-        <w:r>
-          <w:rPr/>
           <w:tab/>
-        </w:r>
-        <w:r>
-          <w:rPr/>
           <w:t xml:space="preserve">6</w:t>
         </w:r>
       </w:hyperlink>
@@ -1852,13 +1672,7 @@
         <w:r>
           <w:rPr/>
           <w:t xml:space="preserve">Tabla 3. Requerimientos de SOAR-COLLECT y SOAR-DETECT</w:t>
-        </w:r>
-        <w:r>
-          <w:rPr/>
           <w:tab/>
-        </w:r>
-        <w:r>
-          <w:rPr/>
           <w:t xml:space="preserve">6</w:t>
         </w:r>
       </w:hyperlink>
@@ -1871,13 +1685,7 @@
         <w:r>
           <w:rPr/>
           <w:t xml:space="preserve">Tabla 4. Requerimientos de SOAR-VALIDATE y SOAR-CLASSIFY</w:t>
-        </w:r>
-        <w:r>
-          <w:rPr/>
           <w:tab/>
-        </w:r>
-        <w:r>
-          <w:rPr/>
           <w:t xml:space="preserve">6</w:t>
         </w:r>
       </w:hyperlink>
@@ -1890,13 +1698,7 @@
         <w:r>
           <w:rPr/>
           <w:t xml:space="preserve">Tabla 5. Requerimientos de SOAR-EXECUTE y de los niveles</w:t>
-        </w:r>
-        <w:r>
-          <w:rPr/>
           <w:tab/>
-        </w:r>
-        <w:r>
-          <w:rPr/>
           <w:t xml:space="preserve">7</w:t>
         </w:r>
       </w:hyperlink>
@@ -1909,13 +1711,7 @@
         <w:r>
           <w:rPr/>
           <w:t xml:space="preserve">Tabla 6. Requerimientos de SOAR-NOTIFY y SOAR-CONSOLE</w:t>
-        </w:r>
-        <w:r>
-          <w:rPr/>
           <w:tab/>
-        </w:r>
-        <w:r>
-          <w:rPr/>
           <w:t xml:space="preserve">7</w:t>
         </w:r>
       </w:hyperlink>
@@ -1928,13 +1724,7 @@
         <w:r>
           <w:rPr/>
           <w:t xml:space="preserve">Tabla 7. Requerimientos de SOAR-AUDIT y del alta de inquilinos</w:t>
-        </w:r>
-        <w:r>
-          <w:rPr/>
           <w:tab/>
-        </w:r>
-        <w:r>
-          <w:rPr/>
           <w:t xml:space="preserve">8</w:t>
         </w:r>
       </w:hyperlink>
@@ -1947,13 +1737,7 @@
         <w:r>
           <w:rPr/>
           <w:t xml:space="preserve">Tabla 8. Requerimientos no funcionales</w:t>
-        </w:r>
-        <w:r>
-          <w:rPr/>
           <w:tab/>
-        </w:r>
-        <w:r>
-          <w:rPr/>
           <w:t xml:space="preserve">8</w:t>
         </w:r>
       </w:hyperlink>
@@ -1966,13 +1750,7 @@
         <w:r>
           <w:rPr/>
           <w:t xml:space="preserve">Tabla 9. Requerimientos legales y normativos</w:t>
-        </w:r>
-        <w:r>
-          <w:rPr/>
           <w:tab/>
-        </w:r>
-        <w:r>
-          <w:rPr/>
           <w:t xml:space="preserve">9</w:t>
         </w:r>
       </w:hyperlink>
@@ -1985,13 +1763,7 @@
         <w:r>
           <w:rPr/>
           <w:t xml:space="preserve">Tabla 10. Restricciones R1 a R4</w:t>
-        </w:r>
-        <w:r>
-          <w:rPr/>
           <w:tab/>
-        </w:r>
-        <w:r>
-          <w:rPr/>
           <w:t xml:space="preserve">10</w:t>
         </w:r>
       </w:hyperlink>
@@ -2004,13 +1776,7 @@
         <w:r>
           <w:rPr/>
           <w:t xml:space="preserve">Tabla 11. Casos de uso del sistema</w:t>
-        </w:r>
-        <w:r>
-          <w:rPr/>
           <w:tab/>
-        </w:r>
-        <w:r>
-          <w:rPr/>
           <w:t xml:space="preserve">11</w:t>
         </w:r>
       </w:hyperlink>
@@ -2023,13 +1789,7 @@
         <w:r>
           <w:rPr/>
           <w:t xml:space="preserve">Tabla 12. Motivos de rechazo existentes en el esquema</w:t>
-        </w:r>
-        <w:r>
-          <w:rPr/>
           <w:tab/>
-        </w:r>
-        <w:r>
-          <w:rPr/>
           <w:t xml:space="preserve">13</w:t>
         </w:r>
       </w:hyperlink>
@@ -2042,13 +1802,7 @@
         <w:r>
           <w:rPr/>
           <w:t xml:space="preserve">Tabla 13. Resumen de la priorización MoSCoW</w:t>
-        </w:r>
-        <w:r>
-          <w:rPr/>
           <w:tab/>
-        </w:r>
-        <w:r>
-          <w:rPr/>
           <w:t xml:space="preserve">14</w:t>
         </w:r>
       </w:hyperlink>
@@ -2061,13 +1815,7 @@
         <w:r>
           <w:rPr/>
           <w:t xml:space="preserve">Tabla 14. Trazabilidad de requerimientos a componentes y pruebas</w:t>
-        </w:r>
-        <w:r>
-          <w:rPr/>
           <w:tab/>
-        </w:r>
-        <w:r>
-          <w:rPr/>
           <w:t xml:space="preserve">15</w:t>
         </w:r>
       </w:hyperlink>
@@ -2150,27 +1898,12 @@
       <w:bookmarkStart w:id="5001" w:name="_Tab001"/>
       <w:r>
         <w:t xml:space="preserve">Tabla </w:t>
-      </w:r>
-      <w:r>
         <w:fldChar w:fldCharType="begin"/>
-      </w:r>
-      <w:r>
         <w:instrText xml:space="preserve"> SEQ Tabla \* ARABIC </w:instrText>
-      </w:r>
-      <w:r>
         <w:fldChar w:fldCharType="separate"/>
-      </w:r>
-      <w:r>
         <w:t>1</w:t>
-      </w:r>
-      <w:r>
         <w:fldChar w:fldCharType="end"/>
-      </w:r>
-      <w:r>
-        <w:t xml:space="preserve">. </w:t>
-      </w:r>
-      <w:r>
-        <w:t>Identificadores usados en este documento</w:t>
+        <w:t xml:space="preserve">. Identificadores usados en este documento</w:t>
       </w:r>
       <w:bookmarkEnd w:id="5001"/>
     </w:p>
@@ -2552,27 +2285,12 @@
       <w:bookmarkStart w:id="5002" w:name="_Tab002"/>
       <w:r>
         <w:t xml:space="preserve">Tabla </w:t>
-      </w:r>
-      <w:r>
         <w:fldChar w:fldCharType="begin"/>
-      </w:r>
-      <w:r>
         <w:instrText xml:space="preserve"> SEQ Tabla \* ARABIC </w:instrText>
-      </w:r>
-      <w:r>
         <w:fldChar w:fldCharType="separate"/>
-      </w:r>
-      <w:r>
         <w:t>2</w:t>
-      </w:r>
-      <w:r>
         <w:fldChar w:fldCharType="end"/>
-      </w:r>
-      <w:r>
-        <w:t xml:space="preserve">. </w:t>
-      </w:r>
-      <w:r>
-        <w:t>Actores del sistema</w:t>
+        <w:t xml:space="preserve">. Actores del sistema</w:t>
       </w:r>
       <w:bookmarkEnd w:id="5002"/>
     </w:p>
@@ -2887,27 +2605,12 @@
       <w:bookmarkStart w:id="5003" w:name="_Tab003"/>
       <w:r>
         <w:t xml:space="preserve">Tabla </w:t>
-      </w:r>
-      <w:r>
         <w:fldChar w:fldCharType="begin"/>
-      </w:r>
-      <w:r>
         <w:instrText xml:space="preserve"> SEQ Tabla \* ARABIC </w:instrText>
-      </w:r>
-      <w:r>
         <w:fldChar w:fldCharType="separate"/>
-      </w:r>
-      <w:r>
         <w:t>3</w:t>
-      </w:r>
-      <w:r>
         <w:fldChar w:fldCharType="end"/>
-      </w:r>
-      <w:r>
-        <w:t xml:space="preserve">. </w:t>
-      </w:r>
-      <w:r>
-        <w:t>Requerimientos de SOAR-COLLECT y SOAR-DETECT</w:t>
+        <w:t xml:space="preserve">. Requerimientos de SOAR-COLLECT y SOAR-DETECT</w:t>
       </w:r>
       <w:bookmarkEnd w:id="5003"/>
     </w:p>
@@ -3372,27 +3075,12 @@
       <w:bookmarkStart w:id="5004" w:name="_Tab004"/>
       <w:r>
         <w:t xml:space="preserve">Tabla </w:t>
-      </w:r>
-      <w:r>
         <w:fldChar w:fldCharType="begin"/>
-      </w:r>
-      <w:r>
         <w:instrText xml:space="preserve"> SEQ Tabla \* ARABIC </w:instrText>
-      </w:r>
-      <w:r>
         <w:fldChar w:fldCharType="separate"/>
-      </w:r>
-      <w:r>
         <w:t>4</w:t>
-      </w:r>
-      <w:r>
         <w:fldChar w:fldCharType="end"/>
-      </w:r>
-      <w:r>
-        <w:t xml:space="preserve">. </w:t>
-      </w:r>
-      <w:r>
-        <w:t>Requerimientos de SOAR-VALIDATE y SOAR-CLASSIFY</w:t>
+        <w:t xml:space="preserve">. Requerimientos de SOAR-VALIDATE y SOAR-CLASSIFY</w:t>
       </w:r>
       <w:bookmarkEnd w:id="5004"/>
     </w:p>
@@ -4052,27 +3740,12 @@
       <w:bookmarkStart w:id="5005" w:name="_Tab005"/>
       <w:r>
         <w:t xml:space="preserve">Tabla </w:t>
-      </w:r>
-      <w:r>
         <w:fldChar w:fldCharType="begin"/>
-      </w:r>
-      <w:r>
         <w:instrText xml:space="preserve"> SEQ Tabla \* ARABIC </w:instrText>
-      </w:r>
-      <w:r>
         <w:fldChar w:fldCharType="separate"/>
-      </w:r>
-      <w:r>
         <w:t>5</w:t>
-      </w:r>
-      <w:r>
         <w:fldChar w:fldCharType="end"/>
-      </w:r>
-      <w:r>
-        <w:t xml:space="preserve">. </w:t>
-      </w:r>
-      <w:r>
-        <w:t>Requerimientos de SOAR-EXECUTE y de los niveles</w:t>
+        <w:t xml:space="preserve">. Requerimientos de SOAR-EXECUTE y de los niveles</w:t>
       </w:r>
       <w:bookmarkEnd w:id="5005"/>
     </w:p>
@@ -4727,27 +4400,12 @@
       <w:bookmarkStart w:id="5006" w:name="_Tab006"/>
       <w:r>
         <w:t xml:space="preserve">Tabla </w:t>
-      </w:r>
-      <w:r>
         <w:fldChar w:fldCharType="begin"/>
-      </w:r>
-      <w:r>
         <w:instrText xml:space="preserve"> SEQ Tabla \* ARABIC </w:instrText>
-      </w:r>
-      <w:r>
         <w:fldChar w:fldCharType="separate"/>
-      </w:r>
-      <w:r>
         <w:t>6</w:t>
-      </w:r>
-      <w:r>
         <w:fldChar w:fldCharType="end"/>
-      </w:r>
-      <w:r>
-        <w:t xml:space="preserve">. </w:t>
-      </w:r>
-      <w:r>
-        <w:t>Requerimientos de SOAR-NOTIFY y SOAR-CONSOLE</w:t>
+        <w:t xml:space="preserve">. Requerimientos de SOAR-NOTIFY y SOAR-CONSOLE</w:t>
       </w:r>
       <w:bookmarkEnd w:id="5006"/>
     </w:p>
@@ -5591,27 +5249,12 @@
       <w:bookmarkStart w:id="5007" w:name="_Tab007"/>
       <w:r>
         <w:t xml:space="preserve">Tabla </w:t>
-      </w:r>
-      <w:r>
         <w:fldChar w:fldCharType="begin"/>
-      </w:r>
-      <w:r>
         <w:instrText xml:space="preserve"> SEQ Tabla \* ARABIC </w:instrText>
-      </w:r>
-      <w:r>
         <w:fldChar w:fldCharType="separate"/>
-      </w:r>
-      <w:r>
         <w:t>7</w:t>
-      </w:r>
-      <w:r>
         <w:fldChar w:fldCharType="end"/>
-      </w:r>
-      <w:r>
-        <w:t xml:space="preserve">. </w:t>
-      </w:r>
-      <w:r>
-        <w:t>Requerimientos de SOAR-AUDIT y del alta de inquilinos</w:t>
+        <w:t xml:space="preserve">. Requerimientos de SOAR-AUDIT y del alta de inquilinos</w:t>
       </w:r>
       <w:bookmarkEnd w:id="5007"/>
     </w:p>
@@ -6018,27 +5661,12 @@
       <w:bookmarkStart w:id="5008" w:name="_Tab008"/>
       <w:r>
         <w:t xml:space="preserve">Tabla </w:t>
-      </w:r>
-      <w:r>
         <w:fldChar w:fldCharType="begin"/>
-      </w:r>
-      <w:r>
         <w:instrText xml:space="preserve"> SEQ Tabla \* ARABIC </w:instrText>
-      </w:r>
-      <w:r>
         <w:fldChar w:fldCharType="separate"/>
-      </w:r>
-      <w:r>
         <w:t>8</w:t>
-      </w:r>
-      <w:r>
         <w:fldChar w:fldCharType="end"/>
-      </w:r>
-      <w:r>
-        <w:t xml:space="preserve">. </w:t>
-      </w:r>
-      <w:r>
-        <w:t>Requerimientos no funcionales</w:t>
+        <w:t xml:space="preserve">. Requerimientos no funcionales</w:t>
       </w:r>
       <w:bookmarkEnd w:id="5008"/>
     </w:p>
@@ -7181,27 +6809,12 @@
       <w:bookmarkStart w:id="5009" w:name="_Tab009"/>
       <w:r>
         <w:t xml:space="preserve">Tabla </w:t>
-      </w:r>
-      <w:r>
         <w:fldChar w:fldCharType="begin"/>
-      </w:r>
-      <w:r>
         <w:instrText xml:space="preserve"> SEQ Tabla \* ARABIC </w:instrText>
-      </w:r>
-      <w:r>
         <w:fldChar w:fldCharType="separate"/>
-      </w:r>
-      <w:r>
         <w:t>9</w:t>
-      </w:r>
-      <w:r>
         <w:fldChar w:fldCharType="end"/>
-      </w:r>
-      <w:r>
-        <w:t xml:space="preserve">. </w:t>
-      </w:r>
-      <w:r>
-        <w:t>Requerimientos legales y normativos</w:t>
+        <w:t xml:space="preserve">. Requerimientos legales y normativos</w:t>
       </w:r>
       <w:bookmarkEnd w:id="5009"/>
     </w:p>
@@ -8116,27 +7729,12 @@
       <w:bookmarkStart w:id="5010" w:name="_Tab010"/>
       <w:r>
         <w:t xml:space="preserve">Tabla </w:t>
-      </w:r>
-      <w:r>
         <w:fldChar w:fldCharType="begin"/>
-      </w:r>
-      <w:r>
         <w:instrText xml:space="preserve"> SEQ Tabla \* ARABIC </w:instrText>
-      </w:r>
-      <w:r>
         <w:fldChar w:fldCharType="separate"/>
-      </w:r>
-      <w:r>
         <w:t>10</w:t>
-      </w:r>
-      <w:r>
         <w:fldChar w:fldCharType="end"/>
-      </w:r>
-      <w:r>
-        <w:t xml:space="preserve">. </w:t>
-      </w:r>
-      <w:r>
-        <w:t>Restricciones R1 a R4</w:t>
+        <w:t xml:space="preserve">. Restricciones R1 a R4</w:t>
       </w:r>
       <w:bookmarkEnd w:id="5010"/>
     </w:p>
@@ -8722,27 +8320,12 @@
       <w:bookmarkStart w:id="3001" w:name="_Fig001"/>
       <w:r>
         <w:t xml:space="preserve">Figura </w:t>
-      </w:r>
-      <w:r>
         <w:fldChar w:fldCharType="begin"/>
-      </w:r>
-      <w:r>
         <w:instrText xml:space="preserve"> SEQ Figura \* ARABIC </w:instrText>
-      </w:r>
-      <w:r>
         <w:fldChar w:fldCharType="separate"/>
-      </w:r>
-      <w:r>
         <w:t>1</w:t>
-      </w:r>
-      <w:r>
         <w:fldChar w:fldCharType="end"/>
-      </w:r>
-      <w:r>
-        <w:t xml:space="preserve">. </w:t>
-      </w:r>
-      <w:r>
-        <w:t>Casos de uso del sistema y sus actores</w:t>
+        <w:t xml:space="preserve">. Casos de uso del sistema y sus actores</w:t>
       </w:r>
       <w:bookmarkEnd w:id="3001"/>
     </w:p>
@@ -8755,27 +8338,12 @@
       <w:bookmarkStart w:id="5011" w:name="_Tab011"/>
       <w:r>
         <w:t xml:space="preserve">Tabla </w:t>
-      </w:r>
-      <w:r>
         <w:fldChar w:fldCharType="begin"/>
-      </w:r>
-      <w:r>
         <w:instrText xml:space="preserve"> SEQ Tabla \* ARABIC </w:instrText>
-      </w:r>
-      <w:r>
         <w:fldChar w:fldCharType="separate"/>
-      </w:r>
-      <w:r>
         <w:t>11</w:t>
-      </w:r>
-      <w:r>
         <w:fldChar w:fldCharType="end"/>
-      </w:r>
-      <w:r>
-        <w:t xml:space="preserve">. </w:t>
-      </w:r>
-      <w:r>
-        <w:t>Casos de uso del sistema</w:t>
+        <w:t xml:space="preserve">. Casos de uso del sistema</w:t>
       </w:r>
       <w:bookmarkEnd w:id="5011"/>
     </w:p>
@@ -9590,27 +9158,12 @@
       <w:bookmarkStart w:id="3002" w:name="_Fig002"/>
       <w:r>
         <w:t xml:space="preserve">Figura </w:t>
-      </w:r>
-      <w:r>
         <w:fldChar w:fldCharType="begin"/>
-      </w:r>
-      <w:r>
         <w:instrText xml:space="preserve"> SEQ Figura \* ARABIC </w:instrText>
-      </w:r>
-      <w:r>
         <w:fldChar w:fldCharType="separate"/>
-      </w:r>
-      <w:r>
         <w:t>2</w:t>
-      </w:r>
-      <w:r>
         <w:fldChar w:fldCharType="end"/>
-      </w:r>
-      <w:r>
-        <w:t xml:space="preserve">. </w:t>
-      </w:r>
-      <w:r>
-        <w:t>Tratamiento de una decisión según su nivel de autonomía</w:t>
+        <w:t xml:space="preserve">. Tratamiento de una decisión según su nivel de autonomía</w:t>
       </w:r>
       <w:bookmarkEnd w:id="3002"/>
     </w:p>
@@ -9664,7 +9217,7 @@
     </w:p>
     <w:p>
       <w:r>
-        <w:t xml:space="preserve">El esquema de SOAR-AUDIT admite seis estados en </w:t>
+        <w:t xml:space="preserve">El esquema de SOAR-AUDIT admite siete estados en </w:t>
       </w:r>
       <w:r>
         <w:rPr>
@@ -9684,6 +9237,17 @@
           <w:shd w:val="clear" w:color="auto" w:fill="F2F2F2"/>
         </w:rPr>
         <w:t>PENDING</w:t>
+      </w:r>
+      <w:r>
+        <w:t xml:space="preserve">, </w:t>
+      </w:r>
+      <w:r>
+        <w:rPr>
+          <w:rFonts w:ascii="Consolas" w:hAnsi="Consolas"/>
+          <w:sz w:val="19"/>
+          <w:shd w:val="clear" w:color="auto" w:fill="F2F2F2"/>
+        </w:rPr>
+        <w:t>AWAITING_APPROVAL</w:t>
       </w:r>
       <w:r>
         <w:t xml:space="preserve">, </w:t>
@@ -9750,7 +9314,7 @@
         <w:t>✅</w:t>
       </w:r>
       <w:r>
-        <w:t>. El diagrama muestra las transiciones previstas.</w:t>
+        <w:t xml:space="preserve">. AWAITING_APPROVAL es el estado nuevo del nivel 3 (D-38). El diagrama muestra las transiciones previstas.</w:t>
       </w:r>
     </w:p>
     <w:p>
@@ -9762,7 +9326,7 @@
       <w:r>
         <w:drawing>
           <wp:inline xmlns:a="http://schemas.openxmlformats.org/drawingml/2006/main" xmlns:pic="http://schemas.openxmlformats.org/drawingml/2006/picture">
-            <wp:extent cx="5400000" cy="1935370"/>
+            <wp:extent cx="5400000" cy="1796000"/>
             <wp:docPr id="3" name="Picture 3"/>
             <wp:cNvGraphicFramePr>
               <a:graphicFrameLocks noChangeAspect="1"/>
@@ -9783,7 +9347,7 @@
                   <pic:spPr>
                     <a:xfrm>
                       <a:off x="0" y="0"/>
-                      <a:ext cx="5400000" cy="1935370"/>
+                      <a:ext cx="5400000" cy="1796000"/>
                     </a:xfrm>
                     <a:prstGeom prst="rect"/>
                   </pic:spPr>
@@ -9802,27 +9366,12 @@
       <w:bookmarkStart w:id="3003" w:name="_Fig003"/>
       <w:r>
         <w:t xml:space="preserve">Figura </w:t>
-      </w:r>
-      <w:r>
         <w:fldChar w:fldCharType="begin"/>
-      </w:r>
-      <w:r>
         <w:instrText xml:space="preserve"> SEQ Figura \* ARABIC </w:instrText>
-      </w:r>
-      <w:r>
         <w:fldChar w:fldCharType="separate"/>
-      </w:r>
-      <w:r>
         <w:t>3</w:t>
-      </w:r>
-      <w:r>
         <w:fldChar w:fldCharType="end"/>
-      </w:r>
-      <w:r>
-        <w:t xml:space="preserve">. </w:t>
-      </w:r>
-      <w:r>
-        <w:t>Estados del ticket</w:t>
+        <w:t xml:space="preserve">. Estados del ticket</w:t>
       </w:r>
       <w:bookmarkEnd w:id="3003"/>
     </w:p>
@@ -9835,13 +9384,97 @@
           <w:b/>
           <w:sz w:val="20"/>
         </w:rPr>
-        <w:t>Vacíos del modelo de estados.</w:t>
+        <w:t>Cómo se resuelven los vacíos del modelo de estados (D-38).</w:t>
       </w:r>
       <w:r>
         <w:rPr>
           <w:sz w:val="20"/>
         </w:rPr>
-        <w:t xml:space="preserve"> El esquema no tiene un estado propio para «esperando aprobación de nivel 3» ni para «revertido». Tampoco define si un ticket </w:t>
+        <w:t xml:space="preserve"> El nivel 3 que VALIDATE aprueba espera en </w:t>
+      </w:r>
+      <w:r>
+        <w:rPr>
+          <w:rFonts w:ascii="Consolas" w:hAnsi="Consolas"/>
+          <w:sz w:val="17"/>
+          <w:shd w:val="clear" w:color="auto" w:fill="F2F2F2"/>
+        </w:rPr>
+        <w:t>AWAITING_APPROVAL</w:t>
+      </w:r>
+      <w:r>
+        <w:rPr>
+          <w:sz w:val="20"/>
+        </w:rPr>
+        <w:t xml:space="preserve">, con un temporizador de 2 días (D-32); SOAR-EXECUTE sólo toma tickets </w:t>
+      </w:r>
+      <w:r>
+        <w:rPr>
+          <w:rFonts w:ascii="Consolas" w:hAnsi="Consolas"/>
+          <w:sz w:val="17"/>
+          <w:shd w:val="clear" w:color="auto" w:fill="F2F2F2"/>
+        </w:rPr>
+        <w:t>PENDING</w:t>
+      </w:r>
+      <w:r>
+        <w:rPr>
+          <w:sz w:val="20"/>
+        </w:rPr>
+        <w:t xml:space="preserve">, así que no ejecuta nada sin aprobación. Si un integrante aprueba (Telegram o consola), el ticket pasa a </w:t>
+      </w:r>
+      <w:r>
+        <w:rPr>
+          <w:rFonts w:ascii="Consolas" w:hAnsi="Consolas"/>
+          <w:sz w:val="17"/>
+          <w:shd w:val="clear" w:color="auto" w:fill="F2F2F2"/>
+        </w:rPr>
+        <w:t>PENDING</w:t>
+      </w:r>
+      <w:r>
+        <w:rPr>
+          <w:sz w:val="20"/>
+        </w:rPr>
+        <w:t xml:space="preserve">; si rechaza, con motivo obligatorio, pasa a </w:t>
+      </w:r>
+      <w:r>
+        <w:rPr>
+          <w:rFonts w:ascii="Consolas" w:hAnsi="Consolas"/>
+          <w:sz w:val="17"/>
+          <w:shd w:val="clear" w:color="auto" w:fill="F2F2F2"/>
+        </w:rPr>
+        <w:t>REJECTED</w:t>
+      </w:r>
+      <w:r>
+        <w:rPr>
+          <w:sz w:val="20"/>
+        </w:rPr>
+        <w:t xml:space="preserve">; si el plazo vence, pasa a </w:t>
+      </w:r>
+      <w:r>
+        <w:rPr>
+          <w:rFonts w:ascii="Consolas" w:hAnsi="Consolas"/>
+          <w:sz w:val="17"/>
+          <w:shd w:val="clear" w:color="auto" w:fill="F2F2F2"/>
+        </w:rPr>
+        <w:t>MANUAL_TRIAGE</w:t>
+      </w:r>
+      <w:r>
+        <w:rPr>
+          <w:sz w:val="20"/>
+        </w:rPr>
+        <w:t xml:space="preserve"> con el motivo </w:t>
+      </w:r>
+      <w:r>
+        <w:rPr>
+          <w:rFonts w:ascii="Consolas" w:hAnsi="Consolas"/>
+          <w:sz w:val="17"/>
+          <w:shd w:val="clear" w:color="auto" w:fill="F2F2F2"/>
+        </w:rPr>
+        <w:t>APROBACION_VENCIDA</w:t>
+      </w:r>
+      <w:r>
+        <w:rPr>
+          <w:sz w:val="20"/>
+        </w:rPr>
+        <w:t xml:space="preserve"> (D-34), sin ejecutar. Si la orden a Wazuh falla, el ticket queda en </w:t>
       </w:r>
       <w:r>
         <w:rPr>
@@ -9855,16 +9488,41 @@
         <w:rPr>
           <w:sz w:val="20"/>
         </w:rPr>
-        <w:t xml:space="preserve"> vuelve a revisión. </w:t>
+        <w:t xml:space="preserve">, se avisa al equipo y no se reintenta solo: una persona decide. La reversión no cambia el estado: el ticket sigue en </w:t>
       </w:r>
       <w:r>
         <w:rPr>
-          <w:b/>
-          <w:color w:val="7A4A00"/>
+          <w:rFonts w:ascii="Consolas" w:hAnsi="Consolas"/>
+          <w:sz w:val="17"/>
+          <w:shd w:val="clear" w:color="auto" w:fill="F2F2F2"/>
+        </w:rPr>
+        <w:t>SUCCESS</w:t>
+      </w:r>
+      <w:r>
+        <w:rPr>
           <w:sz w:val="20"/>
-          <w:highlight w:val="yellow"/>
         </w:rPr>
-        <w:t>[POR CONFIRMAR: estado del ticket mientras espera la aprobación de nivel 3, uso de REJECTED y registro de la reversión — preguntar a Rodrigo]</w:t>
+        <w:t xml:space="preserve"> y la reversión queda como eventos </w:t>
+      </w:r>
+      <w:r>
+        <w:rPr>
+          <w:rFonts w:ascii="Consolas" w:hAnsi="Consolas"/>
+          <w:sz w:val="17"/>
+          <w:shd w:val="clear" w:color="auto" w:fill="F2F2F2"/>
+        </w:rPr>
+        <w:t>REVERSION_*</w:t>
+      </w:r>
+      <w:r>
+        <w:rPr>
+          <w:sz w:val="20"/>
+        </w:rPr>
+        <w:t xml:space="preserve"> en la bitácora y en la tabla de temporizadores. </w:t>
+      </w:r>
+      <w:r>
+        <w:rPr>
+          <w:rFonts w:ascii="Segoe UI Emoji" w:hAnsi="Segoe UI Emoji"/>
+        </w:rPr>
+        <w:t>✅</w:t>
       </w:r>
     </w:p>
     <w:p>
@@ -9876,27 +9534,12 @@
       <w:bookmarkStart w:id="5012" w:name="_Tab012"/>
       <w:r>
         <w:t xml:space="preserve">Tabla </w:t>
-      </w:r>
-      <w:r>
         <w:fldChar w:fldCharType="begin"/>
-      </w:r>
-      <w:r>
         <w:instrText xml:space="preserve"> SEQ Tabla \* ARABIC </w:instrText>
-      </w:r>
-      <w:r>
         <w:fldChar w:fldCharType="separate"/>
-      </w:r>
-      <w:r>
         <w:t>12</w:t>
-      </w:r>
-      <w:r>
         <w:fldChar w:fldCharType="end"/>
-      </w:r>
-      <w:r>
-        <w:t xml:space="preserve">. </w:t>
-      </w:r>
-      <w:r>
-        <w:t>Motivos de rechazo existentes en el esquema</w:t>
+        <w:t xml:space="preserve">. Motivos de rechazo existentes en el esquema</w:t>
       </w:r>
       <w:bookmarkEnd w:id="5012"/>
     </w:p>
@@ -10544,6 +10187,122 @@
           </w:p>
         </w:tc>
       </w:tr>
+      <w:tr>
+        <w:trPr>
+          <w:cantSplit/>
+        </w:trPr>
+        <w:tc>
+          <w:tcPr>
+            <w:tcW w:type="dxa" w:w="3888"/>
+            <w:vAlign w:val="top"/>
+          </w:tcPr>
+          <w:p>
+            <w:pPr>
+              <w:pStyle w:val="Textodetabla"/>
+            </w:pPr>
+            <w:r>
+              <w:rPr>
+                <w:rFonts w:ascii="Consolas" w:hAnsi="Consolas"/>
+                <w:sz w:val="16"/>
+                <w:shd w:val="clear" w:color="auto" w:fill="F2F2F2"/>
+              </w:rPr>
+              <w:t>FAMILIA_NO_COINCIDE</w:t>
+            </w:r>
+          </w:p>
+        </w:tc>
+        <w:tc>
+          <w:tcPr>
+            <w:tcW w:type="dxa" w:w="1630"/>
+            <w:vAlign w:val="top"/>
+          </w:tcPr>
+          <w:p>
+            <w:pPr>
+              <w:pStyle w:val="Textodetabla"/>
+            </w:pPr>
+            <w:r>
+              <w:rPr>
+                <w:sz w:val="19"/>
+              </w:rPr>
+              <w:t>Chequeos</w:t>
+            </w:r>
+          </w:p>
+        </w:tc>
+        <w:tc>
+          <w:tcPr>
+            <w:tcW w:type="dxa" w:w="3888"/>
+            <w:vAlign w:val="top"/>
+          </w:tcPr>
+          <w:p>
+            <w:pPr>
+              <w:pStyle w:val="Textodetabla"/>
+            </w:pPr>
+            <w:r>
+              <w:rPr>
+                <w:sz w:val="19"/>
+              </w:rPr>
+              <w:t>2. La familia del modelo no coincide con la de la regla de sobre</w:t>
+            </w:r>
+          </w:p>
+        </w:tc>
+      </w:tr>
+      <w:tr>
+        <w:trPr>
+          <w:cantSplit/>
+        </w:trPr>
+        <w:tc>
+          <w:tcPr>
+            <w:tcW w:type="dxa" w:w="3888"/>
+            <w:vAlign w:val="top"/>
+          </w:tcPr>
+          <w:p>
+            <w:pPr>
+              <w:pStyle w:val="Textodetabla"/>
+            </w:pPr>
+            <w:r>
+              <w:rPr>
+                <w:rFonts w:ascii="Consolas" w:hAnsi="Consolas"/>
+                <w:sz w:val="16"/>
+                <w:shd w:val="clear" w:color="auto" w:fill="F2F2F2"/>
+              </w:rPr>
+              <w:t>APROBACION_VENCIDA</w:t>
+            </w:r>
+          </w:p>
+        </w:tc>
+        <w:tc>
+          <w:tcPr>
+            <w:tcW w:type="dxa" w:w="1630"/>
+            <w:vAlign w:val="top"/>
+          </w:tcPr>
+          <w:p>
+            <w:pPr>
+              <w:pStyle w:val="Textodetabla"/>
+            </w:pPr>
+            <w:r>
+              <w:rPr>
+                <w:sz w:val="19"/>
+              </w:rPr>
+              <w:t>Aprobación</w:t>
+            </w:r>
+          </w:p>
+        </w:tc>
+        <w:tc>
+          <w:tcPr>
+            <w:tcW w:type="dxa" w:w="3888"/>
+            <w:vAlign w:val="top"/>
+          </w:tcPr>
+          <w:p>
+            <w:pPr>
+              <w:pStyle w:val="Textodetabla"/>
+            </w:pPr>
+            <w:r>
+              <w:rPr>
+                <w:sz w:val="19"/>
+              </w:rPr>
+              <w:t>El nivel 3 no tuvo respuesta en 2 días (D-34); no se ejecuta</w:t>
+            </w:r>
+          </w:p>
+        </w:tc>
+      </w:tr>
     </w:tbl>
     <w:p>
       <w:pPr>
@@ -10552,7 +10311,18 @@
     </w:p>
     <w:p>
       <w:r>
-        <w:t xml:space="preserve">Si se acepta D-34, falta un décimo motivo para la aprobación vencida del nivel 3. Por ejemplo, </w:t>
+        <w:t xml:space="preserve">Con D-34 aceptada, el esquema suma dos motivos a los nueve originales: </w:t>
+      </w:r>
+      <w:r>
+        <w:rPr>
+          <w:rFonts w:ascii="Consolas" w:hAnsi="Consolas"/>
+          <w:sz w:val="19"/>
+          <w:shd w:val="clear" w:color="auto" w:fill="F2F2F2"/>
+        </w:rPr>
+        <w:t>FAMILIA_NO_COINCIDE</w:t>
+      </w:r>
+      <w:r>
+        <w:t xml:space="preserve"> (la familia del modelo debe coincidir con la de la regla de sobre) y </w:t>
       </w:r>
       <w:r>
         <w:rPr>
@@ -10563,13 +10333,13 @@
         <w:t>APROBACION_VENCIDA</w:t>
       </w:r>
       <w:r>
-        <w:t xml:space="preserve">. </w:t>
+        <w:t xml:space="preserve"> (nivel 3 sin respuesta en 2 días). Ambos están en el esquema desde la migración del 15-10-2026. </w:t>
       </w:r>
       <w:r>
         <w:rPr>
           <w:rFonts w:ascii="Segoe UI Emoji" w:hAnsi="Segoe UI Emoji"/>
         </w:rPr>
-        <w:t>⏳</w:t>
+        <w:t>✅</w:t>
       </w:r>
     </w:p>
     <w:p>
@@ -10631,27 +10401,12 @@
       <w:bookmarkStart w:id="3004" w:name="_Fig004"/>
       <w:r>
         <w:t xml:space="preserve">Figura </w:t>
-      </w:r>
-      <w:r>
         <w:fldChar w:fldCharType="begin"/>
-      </w:r>
-      <w:r>
         <w:instrText xml:space="preserve"> SEQ Figura \* ARABIC </w:instrText>
-      </w:r>
-      <w:r>
         <w:fldChar w:fldCharType="separate"/>
-      </w:r>
-      <w:r>
         <w:t>4</w:t>
-      </w:r>
-      <w:r>
         <w:fldChar w:fldCharType="end"/>
-      </w:r>
-      <w:r>
-        <w:t xml:space="preserve">. </w:t>
-      </w:r>
-      <w:r>
-        <w:t>Estados del cortacircuito por ámbito</w:t>
+        <w:t xml:space="preserve">. Estados del cortacircuito por ámbito</w:t>
       </w:r>
       <w:bookmarkEnd w:id="3004"/>
     </w:p>
@@ -10707,27 +10462,12 @@
       <w:bookmarkStart w:id="5013" w:name="_Tab013"/>
       <w:r>
         <w:t xml:space="preserve">Tabla </w:t>
-      </w:r>
-      <w:r>
         <w:fldChar w:fldCharType="begin"/>
-      </w:r>
-      <w:r>
         <w:instrText xml:space="preserve"> SEQ Tabla \* ARABIC </w:instrText>
-      </w:r>
-      <w:r>
         <w:fldChar w:fldCharType="separate"/>
-      </w:r>
-      <w:r>
         <w:t>13</w:t>
-      </w:r>
-      <w:r>
         <w:fldChar w:fldCharType="end"/>
-      </w:r>
-      <w:r>
-        <w:t xml:space="preserve">. </w:t>
-      </w:r>
-      <w:r>
-        <w:t>Resumen de la priorización MoSCoW</w:t>
+        <w:t xml:space="preserve">. Resumen de la priorización MoSCoW</w:t>
       </w:r>
       <w:bookmarkEnd w:id="5013"/>
     </w:p>
@@ -11107,27 +10847,12 @@
       <w:bookmarkStart w:id="5014" w:name="_Tab014"/>
       <w:r>
         <w:t xml:space="preserve">Tabla </w:t>
-      </w:r>
-      <w:r>
         <w:fldChar w:fldCharType="begin"/>
-      </w:r>
-      <w:r>
         <w:instrText xml:space="preserve"> SEQ Tabla \* ARABIC </w:instrText>
-      </w:r>
-      <w:r>
         <w:fldChar w:fldCharType="separate"/>
-      </w:r>
-      <w:r>
         <w:t>14</w:t>
-      </w:r>
-      <w:r>
         <w:fldChar w:fldCharType="end"/>
-      </w:r>
-      <w:r>
-        <w:t xml:space="preserve">. </w:t>
-      </w:r>
-      <w:r>
-        <w:t>Trazabilidad de requerimientos a componentes y pruebas</w:t>
+        <w:t xml:space="preserve">. Trazabilidad de requerimientos a componentes y pruebas</w:t>
       </w:r>
       <w:bookmarkEnd w:id="5014"/>
     </w:p>

</xml_diff>

<commit_message>
docs(02): estados del ticket y del cortacircuito al día con #35 y #36
- Figura 4: el cortacircuito se abre solo con 30 alertas en 10 min (incluidas las agrupadas);
  ni un contador de tasa ni una persona lo abren.
- §8.2: hoy existe un solo ámbito, el del inquilino (fila 7 de preguntas-abiertas).
- Motivo DECISION_NO_REGISTRADA (#35): Tabla 12, texto de los motivos y la nota de §8.1.
- Figura 3: flecha del ticket huérfano y «EXECUTE lo toma» (niveles 0 a 2 o nivel 3 aprobado).
</commit_message>
<xml_diff>
--- a/docs/entregables/02_requerimientos.docx
+++ b/docs/entregables/02_requerimientos.docx
@@ -9326,7 +9326,7 @@
       <w:r>
         <w:drawing>
           <wp:inline xmlns:a="http://schemas.openxmlformats.org/drawingml/2006/main" xmlns:pic="http://schemas.openxmlformats.org/drawingml/2006/picture">
-            <wp:extent cx="5400000" cy="1796000"/>
+            <wp:extent cx="5400000" cy="2345455"/>
             <wp:docPr id="3" name="Picture 3"/>
             <wp:cNvGraphicFramePr>
               <a:graphicFrameLocks noChangeAspect="1"/>
@@ -9347,7 +9347,7 @@
                   <pic:spPr>
                     <a:xfrm>
                       <a:off x="0" y="0"/>
-                      <a:ext cx="5400000" cy="1796000"/>
+                      <a:ext cx="5400000" cy="2345455"/>
                     </a:xfrm>
                     <a:prstGeom prst="rect"/>
                   </pic:spPr>
@@ -9516,7 +9516,35 @@
         <w:rPr>
           <w:sz w:val="20"/>
         </w:rPr>
-        <w:t xml:space="preserve"> en la bitácora y en la tabla de temporizadores. </w:t>
+        <w:t xml:space="preserve"> en la bitácora y en la tabla de temporizadores. Si VALIDATE crea el ticket pero no registra la decisión (falla entre los dos pasos), a los 10 minutos SOAR-EXECUTE lo pasa a </w:t>
+      </w:r>
+      <w:r>
+        <w:rPr>
+          <w:rFonts w:ascii="Consolas" w:hAnsi="Consolas"/>
+          <w:sz w:val="17"/>
+          <w:shd w:val="clear" w:color="auto" w:fill="F2F2F2"/>
+        </w:rPr>
+        <w:t>MANUAL_TRIAGE</w:t>
+      </w:r>
+      <w:r>
+        <w:rPr>
+          <w:sz w:val="20"/>
+        </w:rPr>
+        <w:t xml:space="preserve"> con </w:t>
+      </w:r>
+      <w:r>
+        <w:rPr>
+          <w:rFonts w:ascii="Consolas" w:hAnsi="Consolas"/>
+          <w:sz w:val="17"/>
+          <w:shd w:val="clear" w:color="auto" w:fill="F2F2F2"/>
+        </w:rPr>
+        <w:t>DECISION_NO_REGISTRADA</w:t>
+      </w:r>
+      <w:r>
+        <w:rPr>
+          <w:sz w:val="20"/>
+        </w:rPr>
+        <w:t xml:space="preserve"> y se avisa; nunca se reclasifica, para no actuar tarde sobre una alerta vieja. </w:t>
       </w:r>
       <w:r>
         <w:rPr>
@@ -10303,6 +10331,64 @@
           </w:p>
         </w:tc>
       </w:tr>
+      <w:tr>
+        <w:trPr>
+          <w:cantSplit/>
+        </w:trPr>
+        <w:tc>
+          <w:tcPr>
+            <w:tcW w:type="dxa" w:w="3888"/>
+            <w:vAlign w:val="top"/>
+          </w:tcPr>
+          <w:p>
+            <w:pPr>
+              <w:pStyle w:val="Textodetabla"/>
+            </w:pPr>
+            <w:r>
+              <w:rPr>
+                <w:rFonts w:ascii="Consolas" w:hAnsi="Consolas"/>
+                <w:sz w:val="16"/>
+                <w:shd w:val="clear" w:color="auto" w:fill="F2F2F2"/>
+              </w:rPr>
+              <w:t>DECISION_NO_REGISTRADA</w:t>
+            </w:r>
+          </w:p>
+        </w:tc>
+        <w:tc>
+          <w:tcPr>
+            <w:tcW w:type="dxa" w:w="1630"/>
+            <w:vAlign w:val="top"/>
+          </w:tcPr>
+          <w:p>
+            <w:pPr>
+              <w:pStyle w:val="Textodetabla"/>
+            </w:pPr>
+            <w:r>
+              <w:rPr>
+                <w:sz w:val="19"/>
+              </w:rPr>
+              <w:t>Recuperador (EXECUTE)</w:t>
+            </w:r>
+          </w:p>
+        </w:tc>
+        <w:tc>
+          <w:tcPr>
+            <w:tcW w:type="dxa" w:w="3888"/>
+            <w:vAlign w:val="top"/>
+          </w:tcPr>
+          <w:p>
+            <w:pPr>
+              <w:pStyle w:val="Textodetabla"/>
+            </w:pPr>
+            <w:r>
+              <w:rPr>
+                <w:sz w:val="19"/>
+              </w:rPr>
+              <w:t>VALIDATE no registró la decisión 10 minutos después de crear el ticket; pasa a revisión manual con aviso</w:t>
+            </w:r>
+          </w:p>
+        </w:tc>
+      </w:tr>
     </w:tbl>
     <w:p>
       <w:pPr>
@@ -10311,7 +10397,7 @@
     </w:p>
     <w:p>
       <w:r>
-        <w:t xml:space="preserve">Con D-34 aceptada, el esquema suma dos motivos a los nueve originales: </w:t>
+        <w:t xml:space="preserve">El esquema suma tres motivos a los nueve originales: </w:t>
       </w:r>
       <w:r>
         <w:rPr>
@@ -10322,7 +10408,7 @@
         <w:t>FAMILIA_NO_COINCIDE</w:t>
       </w:r>
       <w:r>
-        <w:t xml:space="preserve"> (la familia del modelo debe coincidir con la de la regla de sobre) y </w:t>
+        <w:t xml:space="preserve"> (la familia del modelo debe coincidir con la de la regla de sobre), </w:t>
       </w:r>
       <w:r>
         <w:rPr>
@@ -10333,7 +10419,18 @@
         <w:t>APROBACION_VENCIDA</w:t>
       </w:r>
       <w:r>
-        <w:t xml:space="preserve"> (nivel 3 sin respuesta en 2 días). Ambos están en el esquema desde la migración del 15-10-2026. </w:t>
+        <w:t xml:space="preserve"> (nivel 3 sin respuesta en 2 días, D-34) y </w:t>
+      </w:r>
+      <w:r>
+        <w:rPr>
+          <w:rFonts w:ascii="Consolas" w:hAnsi="Consolas"/>
+          <w:sz w:val="19"/>
+          <w:shd w:val="clear" w:color="auto" w:fill="F2F2F2"/>
+        </w:rPr>
+        <w:t>DECISION_NO_REGISTRADA</w:t>
+      </w:r>
+      <w:r>
+        <w:t xml:space="preserve"> (ticket huérfano: VALIDATE no registró la decisión 10 minutos después de crear el ticket). Los dos primeros están en el esquema desde la migración del 15-10-2026, y el tercero desde la del 21-10-2026. </w:t>
       </w:r>
       <w:r>
         <w:rPr>
@@ -10361,7 +10458,7 @@
       <w:r>
         <w:drawing>
           <wp:inline xmlns:a="http://schemas.openxmlformats.org/drawingml/2006/main" xmlns:pic="http://schemas.openxmlformats.org/drawingml/2006/picture">
-            <wp:extent cx="3960000" cy="3603600"/>
+            <wp:extent cx="3960000" cy="3815862"/>
             <wp:docPr id="4" name="Picture 4"/>
             <wp:cNvGraphicFramePr>
               <a:graphicFrameLocks noChangeAspect="1"/>
@@ -10382,7 +10479,7 @@
                   <pic:spPr>
                     <a:xfrm>
                       <a:off x="0" y="0"/>
-                      <a:ext cx="3960000" cy="3603600"/>
+                      <a:ext cx="3960000" cy="3815862"/>
                     </a:xfrm>
                     <a:prstGeom prst="rect"/>
                   </pic:spPr>
@@ -10435,12 +10532,13 @@
         <w:t xml:space="preserve">. </w:t>
       </w:r>
       <w:r>
+        <w:t xml:space="preserve">Hoy existe un solo ámbito, el del inquilino: el cortacircuito detiene toda acción automática de una farmacia. Se abre solo, cuando llegan 30 alertas en 10 minutos (incluidas las agrupadas), y sólo una persona lo cierra, desde la consola. La tabla admite otros ámbitos (por equipo o global), pero no se usan. </w:t>
+      </w:r>
+      <w:r>
         <w:rPr>
-          <w:b/>
-          <w:color w:val="7A4A00"/>
-          <w:highlight w:val="yellow"/>
+          <w:rFonts w:ascii="Segoe UI Emoji" w:hAnsi="Segoe UI Emoji"/>
         </w:rPr>
-        <w:t>[POR CONFIRMAR: qué ámbitos existen (por inquilino, por equipo o global) — preguntar a Patricio]</w:t>
+        <w:t>✅</w:t>
       </w:r>
     </w:p>
     <w:p>

</xml_diff>